<commit_message>
NumPy o'quv qo'llanma va hujjatlari tayyor
</commit_message>
<xml_diff>
--- a/O'quv qo'llanma NumPy va Pandas/Qo'shimcha qismi/2. O'quv qo'llanma SIA (I).docx
+++ b/O'quv qo'llanma NumPy va Pandas/Qo'shimcha qismi/2. O'quv qo'llanma SIA (I).docx
@@ -1115,7 +1115,16 @@
           <w:szCs w:val="28"/>
           <w:lang w:val="uz-Cyrl-UZ" w:eastAsia="uz-Cyrl-UZ"/>
         </w:rPr>
-        <w:t>Videokonferensiya aloqa tizimlari</w:t>
+        <w:t>S</w:t>
+      </w:r>
+      <w:r>
+        <w:rPr>
+          <w:rFonts w:ascii="Times New Roman" w:hAnsi="Times New Roman"/>
+          <w:sz w:val="28"/>
+          <w:szCs w:val="28"/>
+          <w:lang w:val="uz-Cyrl-UZ" w:eastAsia="uz-Cyrl-UZ"/>
+        </w:rPr>
+        <w:t>un’iy intellekt asoslari (NumPy kutubxonasi)</w:t>
       </w:r>
       <w:r>
         <w:rPr>
@@ -1143,7 +1152,7 @@
           <w:szCs w:val="28"/>
           <w:lang w:val="uz-Cyrl-UZ" w:eastAsia="en-US"/>
         </w:rPr>
-        <w:t xml:space="preserve">// Darslik. </w:t>
+        <w:t>// </w:t>
       </w:r>
       <w:r>
         <w:rPr>
@@ -1153,7 +1162,47 @@
           <w:szCs w:val="28"/>
           <w:lang w:val="uz-Cyrl-UZ" w:eastAsia="en-US"/>
         </w:rPr>
-        <w:t>Axborot-kommunikatsiya texnologiyalari va aloqa harbiy instituti</w:t>
+        <w:t>O‘quv qo‘llanma</w:t>
+      </w:r>
+      <w:r>
+        <w:rPr>
+          <w:rFonts w:ascii="Times New Roman" w:eastAsiaTheme="minorHAnsi" w:hAnsi="Times New Roman"/>
+          <w:bCs/>
+          <w:sz w:val="28"/>
+          <w:szCs w:val="28"/>
+          <w:lang w:val="uz-Cyrl-UZ" w:eastAsia="en-US"/>
+        </w:rPr>
+        <w:t xml:space="preserve">. </w:t>
+      </w:r>
+      <w:r>
+        <w:rPr>
+          <w:rFonts w:ascii="Times New Roman" w:eastAsiaTheme="minorHAnsi" w:hAnsi="Times New Roman"/>
+          <w:bCs/>
+          <w:sz w:val="28"/>
+          <w:szCs w:val="28"/>
+          <w:lang w:val="uz-Cyrl-UZ" w:eastAsia="en-US"/>
+        </w:rPr>
+        <w:t xml:space="preserve">Axborot-kommunikatsiya texnologiyalari va </w:t>
+      </w:r>
+      <w:r>
+        <w:rPr>
+          <w:rFonts w:ascii="Times New Roman" w:eastAsiaTheme="minorHAnsi" w:hAnsi="Times New Roman"/>
+          <w:bCs/>
+          <w:sz w:val="28"/>
+          <w:szCs w:val="28"/>
+          <w:lang w:val="uz-Cyrl-UZ" w:eastAsia="en-US"/>
+        </w:rPr>
+        <w:t xml:space="preserve">harbiy </w:t>
+      </w:r>
+      <w:r>
+        <w:rPr>
+          <w:rFonts w:ascii="Times New Roman" w:eastAsiaTheme="minorHAnsi" w:hAnsi="Times New Roman"/>
+          <w:bCs/>
+          <w:sz w:val="28"/>
+          <w:szCs w:val="28"/>
+          <w:lang w:val="uz-Cyrl-UZ" w:eastAsia="en-US"/>
+        </w:rPr>
+        <w:t>aloqa instituti</w:t>
       </w:r>
       <w:r>
         <w:rPr>
@@ -1221,7 +1270,7 @@
           <w:bCs/>
           <w:sz w:val="28"/>
           <w:szCs w:val="28"/>
-          <w:lang w:val="en-US" w:eastAsia="en-US"/>
+          <w:lang w:val="uz-Cyrl-UZ" w:eastAsia="en-US"/>
         </w:rPr>
         <w:t>20</w:t>
       </w:r>
@@ -1231,7 +1280,7 @@
           <w:bCs/>
           <w:sz w:val="28"/>
           <w:szCs w:val="28"/>
-          <w:lang w:val="en-US" w:eastAsia="en-US"/>
+          <w:lang w:val="uz-Cyrl-UZ" w:eastAsia="en-US"/>
         </w:rPr>
         <w:t>8</w:t>
       </w:r>

</xml_diff>